<commit_message>
docs: document customer edit/delete in readme, marketing, and manuals
</commit_message>
<xml_diff>
--- a/user manual/PROJECT_MANUAL.docx
+++ b/user manual/PROJECT_MANUAL.docx
@@ -7,7 +7,7 @@
         <w:pStyle w:val="Heading1"/>
       </w:pPr>
       <w:r>
-        <w:t>Computer Store Project User Manual</w:t>
+        <w:t>Gear&amp;Glitch Project User Manual</w:t>
       </w:r>
     </w:p>
     <w:p/>
@@ -22,7 +22,7 @@
     <w:p/>
     <w:p>
       <w:r>
-        <w:t>This project is a small computer store web application combining:</w:t>
+        <w:t>Gear&amp;Glitch is a complete multi-branch sales &amp; management system (SaaS) combining:</w:t>
       </w:r>
     </w:p>
     <w:p>
@@ -30,7 +30,7 @@
         <w:pStyle w:val="ListBullet"/>
       </w:pPr>
       <w:r>
-        <w:t>A shopper storefront for browsing products and managing a cart.</w:t>
+        <w:t>A shopper storefront with product catalog, shopping cart, wishlist, quotes, and two-step checkout.</w:t>
       </w:r>
     </w:p>
     <w:p>
@@ -46,7 +46,7 @@
         <w:pStyle w:val="ListBullet"/>
       </w:pPr>
       <w:r>
-        <w:t>A staff backoffice for repair ticket management.</w:t>
+        <w:t>A unified, role-aware **staff portal** for repair ticket management, stock control, catalog, team, finance, plans, providers, settings, and business oversight.</w:t>
       </w:r>
     </w:p>
     <w:p>
@@ -54,18 +54,24 @@
         <w:pStyle w:val="ListBullet"/>
       </w:pPr>
       <w:r>
-        <w:t>An admin panel for catalog and product image management.</w:t>
+        <w:t>A **control plane** operator dashboard that provisions and manages every client instance.</w:t>
       </w:r>
     </w:p>
     <w:p/>
     <w:p>
       <w:r>
-        <w:t>It uses a vanilla HTML/CSS/JavaScript frontend with a Node.js + Express backend and SQLite for persistence. The server database access layer is built with the `better-sqlite3` Node module.</w:t>
+        <w:t>It uses a **Next.js 14 (Pages Router) + TypeScript** frontend, a **Node.js + Express + TypeScript** backend, and **PostgreSQL** for persistence (one database per client, provisioned on Neon). Multi-tenancy is handled by the control plane, which spins up an isolated Neon DB + Render backend + Vercel frontend for each client.</w:t>
       </w:r>
     </w:p>
     <w:p/>
     <w:p>
       <w:r>
+        <w:t>**Languages &amp; tools:** TypeScript throughout (frontend, backend, control plane), with JavaScript for the control-plane dashboard and Next.js pages, HTML5/CSS3 (design-token system + GPU-accelerated CSS animations) for the UI, and SQL (PostgreSQL DDL/migrations) for data. Infrastructure: Neon (PostgreSQL), Render (backends + control plane), Vercel (storefronts), Cloudinary (images), Cloudflare (DNS).</w:t>
+      </w:r>
+    </w:p>
+    <w:p/>
+    <w:p>
+      <w:r>
         <w:t>---</w:t>
       </w:r>
     </w:p>
@@ -75,15 +81,221 @@
         <w:pStyle w:val="Heading2"/>
       </w:pPr>
       <w:r>
-        <w:t>2. Folder Structure</w:t>
+        <w:t>2. Architecture</w:t>
       </w:r>
     </w:p>
     <w:p/>
     <w:p>
       <w:r>
+        <w:t>Three layers, cleanly separated:</w:t>
+      </w:r>
+    </w:p>
+    <w:p/>
+    <w:p>
+      <w:r>
+        <w:t>Layer | Tech | Port | Purpose</w:t>
+      </w:r>
+    </w:p>
+    <w:p>
+      <w:r>
+        <w:t>------- | ------ | ------ | ---------</w:t>
+      </w:r>
+    </w:p>
+    <w:p>
+      <w:r>
+        <w:t>**Frontend** | Next.js 14 (Pages Router) + TypeScript | 3000 | UI rendering, client-side routing</w:t>
+      </w:r>
+    </w:p>
+    <w:p>
+      <w:r>
+        <w:t>**Backend** | Express + TypeScript | 8020 | REST API, JWT auth, Cloudinary uploads, M-Pesa, PDF generation</w:t>
+      </w:r>
+    </w:p>
+    <w:p>
+      <w:r>
+        <w:t>**Database** | PostgreSQL via `pg` Pool | — | Cloud database (Neon), one schema set per client</w:t>
+      </w:r>
+    </w:p>
+    <w:p>
+      <w:r>
+        <w:t>**Control plane** | Express + TypeScript | 4000 | Central operator dashboard (separate app at `control-plane/`)</w:t>
+      </w:r>
+    </w:p>
+    <w:p/>
+    <w:p>
+      <w:r>
+        <w:t>**Runtime architecture:**</w:t>
+      </w:r>
+    </w:p>
+    <w:p/>
+    <w:p>
+      <w:r>
+        <w:t>```text</w:t>
+      </w:r>
+    </w:p>
+    <w:p>
+      <w:r>
+        <w:t>[Browser Client]</w:t>
+      </w:r>
+    </w:p>
+    <w:p>
+      <w:r>
+        <w:t xml:space="preserve">  ├─ public storefront (/)</w:t>
+      </w:r>
+    </w:p>
+    <w:p>
+      <w:r>
+        <w:t xml:space="preserve">  ├─ customer portal (/dashboard, /my-repairs, /orders)</w:t>
+      </w:r>
+    </w:p>
+    <w:p>
+      <w:r>
+        <w:t xml:space="preserve">  └─ unified staff portal (/admin) — admin/owner/manager/technician/staff roles</w:t>
+      </w:r>
+    </w:p>
+    <w:p>
+      <w:r>
+        <w:t xml:space="preserve">        |</w:t>
+      </w:r>
+    </w:p>
+    <w:p>
+      <w:r>
+        <w:t xml:space="preserve">        | HTTP / Fetch API (proxied by Next.js)</w:t>
+      </w:r>
+    </w:p>
+    <w:p>
+      <w:r>
+        <w:t xml:space="preserve">        v</w:t>
+      </w:r>
+    </w:p>
+    <w:p>
+      <w:r>
+        <w:t>[Express Backend] server/index.ts  (port 8020)</w:t>
+      </w:r>
+    </w:p>
+    <w:p>
+      <w:r>
+        <w:t xml:space="preserve">  ├─ public routes</w:t>
+      </w:r>
+    </w:p>
+    <w:p>
+      <w:r>
+        <w:t xml:space="preserve">  ├─ customer routes</w:t>
+      </w:r>
+    </w:p>
+    <w:p>
+      <w:r>
+        <w:t xml:space="preserve">  ├─ staff/admin/owner routes</w:t>
+      </w:r>
+    </w:p>
+    <w:p>
+      <w:r>
+        <w:t xml:space="preserve">  ├─ provider routes</w:t>
+      </w:r>
+    </w:p>
+    <w:p>
+      <w:r>
+        <w:t xml:space="preserve">  └─ control-plane management routes (x-control-plane-key auth)</w:t>
+      </w:r>
+    </w:p>
+    <w:p>
+      <w:r>
+        <w:t xml:space="preserve">        |</w:t>
+      </w:r>
+    </w:p>
+    <w:p>
+      <w:r>
+        <w:t xml:space="preserve">        v</w:t>
+      </w:r>
+    </w:p>
+    <w:p>
+      <w:r>
+        <w:t>[PostgreSQL] (per-client Neon database)</w:t>
+      </w:r>
+    </w:p>
+    <w:p>
+      <w:r>
         <w:t>```</w:t>
       </w:r>
     </w:p>
+    <w:p/>
+    <w:p>
+      <w:r>
+        <w:t>**Multi-tenant provisioning:**</w:t>
+      </w:r>
+    </w:p>
+    <w:p/>
+    <w:p>
+      <w:r>
+        <w:t>```text</w:t>
+      </w:r>
+    </w:p>
+    <w:p>
+      <w:r>
+        <w:t>[Control Plane] control-plane/  (port 4000, own Neon DB)</w:t>
+      </w:r>
+    </w:p>
+    <w:p>
+      <w:r>
+        <w:t xml:space="preserve">  ├─ Add Client → creates:</w:t>
+      </w:r>
+    </w:p>
+    <w:p>
+      <w:r>
+        <w:t xml:space="preserve">  │    ├─ Neon database (client DB)</w:t>
+      </w:r>
+    </w:p>
+    <w:p>
+      <w:r>
+        <w:t xml:space="preserve">  │    ├─ Render web service (client backend, port 8020)</w:t>
+      </w:r>
+    </w:p>
+    <w:p>
+      <w:r>
+        <w:t xml:space="preserve">  │    └─ Vercel project (client frontend, rootDirectory: "frontend")</w:t>
+      </w:r>
+    </w:p>
+    <w:p>
+      <w:r>
+        <w:t xml:space="preserve">  ├─ per-client CONTROL_PLANE_SECRET for remote management</w:t>
+      </w:r>
+    </w:p>
+    <w:p>
+      <w:r>
+        <w:t xml:space="preserve">  ├─ health monitoring (every 5 min), Slack alerts</w:t>
+      </w:r>
+    </w:p>
+    <w:p>
+      <w:r>
+        <w:t xml:space="preserve">  └─ per-client feature overrides pushed to each backend</w:t>
+      </w:r>
+    </w:p>
+    <w:p>
+      <w:r>
+        <w:t>```</w:t>
+      </w:r>
+    </w:p>
+    <w:p/>
+    <w:p>
+      <w:r>
+        <w:t>---</w:t>
+      </w:r>
+    </w:p>
+    <w:p/>
+    <w:p>
+      <w:pPr>
+        <w:pStyle w:val="Heading2"/>
+      </w:pPr>
+      <w:r>
+        <w:t>3. Folder Structure</w:t>
+      </w:r>
+    </w:p>
+    <w:p/>
+    <w:p>
+      <w:r>
+        <w:t>```</w:t>
+      </w:r>
+    </w:p>
     <w:p>
       <w:r>
         <w:t>Laptop sale/</w:t>
@@ -91,157 +303,207 @@
     </w:p>
     <w:p>
       <w:r>
-        <w:t>├── account.html</w:t>
-      </w:r>
-    </w:p>
-    <w:p>
-      <w:r>
-        <w:t>├── account.js</w:t>
-      </w:r>
-    </w:p>
-    <w:p>
-      <w:r>
-        <w:t>├── customer-auth.js</w:t>
-      </w:r>
-    </w:p>
-    <w:p>
-      <w:r>
-        <w:t>├── cart.html</w:t>
-      </w:r>
-    </w:p>
-    <w:p>
-      <w:r>
-        <w:t>├── cart.js</w:t>
-      </w:r>
-    </w:p>
-    <w:p>
-      <w:r>
-        <w:t>├── index.html</w:t>
-      </w:r>
-    </w:p>
-    <w:p>
-      <w:r>
-        <w:t>├── product.html</w:t>
-      </w:r>
-    </w:p>
-    <w:p>
-      <w:r>
-        <w:t>├── product-page.js</w:t>
-      </w:r>
-    </w:p>
-    <w:p>
-      <w:r>
-        <w:t>├── repair-book.html</w:t>
-      </w:r>
-    </w:p>
-    <w:p>
-      <w:r>
-        <w:t>├── my-repairs.html</w:t>
-      </w:r>
-    </w:p>
-    <w:p>
-      <w:r>
-        <w:t>├── styles.css</w:t>
-      </w:r>
-    </w:p>
-    <w:p>
-      <w:r>
-        <w:t>├── site.js</w:t>
-      </w:r>
-    </w:p>
-    <w:p>
-      <w:r>
-        <w:t>├── server/</w:t>
-      </w:r>
-    </w:p>
-    <w:p>
-      <w:r>
-        <w:t>│   ├── index.js</w:t>
-      </w:r>
-    </w:p>
-    <w:p>
-      <w:r>
-        <w:t>│   ├── db.js</w:t>
-      </w:r>
-    </w:p>
-    <w:p>
-      <w:r>
-        <w:t>│   ├── auth.js</w:t>
-      </w:r>
-    </w:p>
-    <w:p>
-      <w:r>
-        <w:t>│   ├── repairs.js</w:t>
-      </w:r>
-    </w:p>
-    <w:p>
-      <w:r>
-        <w:t>│   ├── notify.js</w:t>
-      </w:r>
-    </w:p>
-    <w:p>
-      <w:r>
-        <w:t>│   └── upload.js</w:t>
-      </w:r>
-    </w:p>
-    <w:p>
-      <w:r>
-        <w:t>├── admin/</w:t>
-      </w:r>
-    </w:p>
-    <w:p>
-      <w:r>
-        <w:t>│   ├── index.html</w:t>
-      </w:r>
-    </w:p>
-    <w:p>
-      <w:r>
-        <w:t>│   ├── admin.js</w:t>
-      </w:r>
-    </w:p>
-    <w:p>
-      <w:r>
-        <w:t>│   └── admin.css</w:t>
-      </w:r>
-    </w:p>
-    <w:p>
-      <w:r>
-        <w:t>├── backoffice/</w:t>
-      </w:r>
-    </w:p>
-    <w:p>
-      <w:r>
-        <w:t>│   ├── index.html</w:t>
-      </w:r>
-    </w:p>
-    <w:p>
-      <w:r>
-        <w:t>│   └── backoffice.js</w:t>
-      </w:r>
-    </w:p>
-    <w:p>
-      <w:r>
-        <w:t>├── data/</w:t>
-      </w:r>
-    </w:p>
-    <w:p>
-      <w:r>
-        <w:t>│   ├── store.db</w:t>
-      </w:r>
-    </w:p>
-    <w:p>
-      <w:r>
-        <w:t>│   └── uploads/</w:t>
-      </w:r>
-    </w:p>
-    <w:p>
-      <w:r>
-        <w:t>├── package.json</w:t>
-      </w:r>
-    </w:p>
-    <w:p>
-      <w:r>
-        <w:t>└── README.md</w:t>
+        <w:t>├── frontend/                 # Next.js 14 (Pages Router + TypeScript)</w:t>
+      </w:r>
+    </w:p>
+    <w:p>
+      <w:r>
+        <w:t>│   ├── components/</w:t>
+      </w:r>
+    </w:p>
+    <w:p>
+      <w:r>
+        <w:t>│   │   ├── ui/                   # Reusable component library (Button, Card, Input, Modal, Badge...)</w:t>
+      </w:r>
+    </w:p>
+    <w:p>
+      <w:r>
+        <w:t>│   │   ├── admin/                # Admin/Owner shared components (AdminProducts, ProvidersPage, ...)</w:t>
+      </w:r>
+    </w:p>
+    <w:p>
+      <w:r>
+        <w:t>│   │   ├── Layout.tsx            # Responsive header (default + springboard modes)</w:t>
+      </w:r>
+    </w:p>
+    <w:p>
+      <w:r>
+        <w:t>│   │   ├── ProductCard.tsx       # Product card with strikethrough sale price</w:t>
+      </w:r>
+    </w:p>
+    <w:p>
+      <w:r>
+        <w:t>│   │   └── ...                   # MarqueeBanner, Toast, Skeleton, LoadingScreen, ScrollReveal...</w:t>
+      </w:r>
+    </w:p>
+    <w:p>
+      <w:r>
+        <w:t>│   ├── lib/</w:t>
+      </w:r>
+    </w:p>
+    <w:p>
+      <w:r>
+        <w:t>│   │   ├── api.ts                # API client with token management</w:t>
+      </w:r>
+    </w:p>
+    <w:p>
+      <w:r>
+        <w:t>│   │   ├── app-context.tsx       # React context — auth, theme, cart, settings, favicon/tab title</w:t>
+      </w:r>
+    </w:p>
+    <w:p>
+      <w:r>
+        <w:t>│   │   ├── types.ts              # TypeScript interfaces</w:t>
+      </w:r>
+    </w:p>
+    <w:p>
+      <w:r>
+        <w:t>│   │   └── features.ts           # useFeature() hook for subscription feature gating</w:t>
+      </w:r>
+    </w:p>
+    <w:p>
+      <w:r>
+        <w:t>│   ├── layouts/                  # Storefront themes + runtime layout engine</w:t>
+      </w:r>
+    </w:p>
+    <w:p>
+      <w:r>
+        <w:t>│   │   ├── original.tsx          # Original theme (premium marketing hero)</w:t>
+      </w:r>
+    </w:p>
+    <w:p>
+      <w:r>
+        <w:t>│   │   ├── amazon.tsx, jumia.tsx, mobile.tsx, custom.tsx</w:t>
+      </w:r>
+    </w:p>
+    <w:p>
+      <w:r>
+        <w:t>│   │   ├── dynamic-engine.tsx    # Generic JSON layout renderer</w:t>
+      </w:r>
+    </w:p>
+    <w:p>
+      <w:r>
+        <w:t>│   │   └── index.tsx             # Layout registry + provider</w:t>
+      </w:r>
+    </w:p>
+    <w:p>
+      <w:r>
+        <w:t>│   ├── pages/</w:t>
+      </w:r>
+    </w:p>
+    <w:p>
+      <w:r>
+        <w:t>│   │   ├── index.tsx             # Homepage</w:t>
+      </w:r>
+    </w:p>
+    <w:p>
+      <w:r>
+        <w:t>│   │   ├── admin.tsx             # Unified role-aware staff portal (replaces /admin, /owner, /backoffice)</w:t>
+      </w:r>
+    </w:p>
+    <w:p>
+      <w:r>
+        <w:t>│   │   ├── login.tsx, dashboard.tsx, cart.tsx, orders.tsx, ...</w:t>
+      </w:r>
+    </w:p>
+    <w:p>
+      <w:r>
+        <w:t>│   │   └── _document.tsx         # Static &lt;title&gt; placeholder (replaced by store name at runtime)</w:t>
+      </w:r>
+    </w:p>
+    <w:p>
+      <w:r>
+        <w:t>│   └── styles/                   # globals.css (design tokens), animations.css</w:t>
+      </w:r>
+    </w:p>
+    <w:p>
+      <w:r>
+        <w:t>├── server/                   # Express backend (TypeScript)</w:t>
+      </w:r>
+    </w:p>
+    <w:p>
+      <w:r>
+        <w:t>│   ├── index.ts              # All API routes (asyncHandler-wrapped)</w:t>
+      </w:r>
+    </w:p>
+    <w:p>
+      <w:r>
+        <w:t>│   ├── db.ts                 # PostgreSQL layer (migrations, seed, settings)</w:t>
+      </w:r>
+    </w:p>
+    <w:p>
+      <w:r>
+        <w:t>│   ├── schema.sql            # PostgreSQL schema</w:t>
+      </w:r>
+    </w:p>
+    <w:p>
+      <w:r>
+        <w:t>│   ├── auth.ts               # JWT auth + login/register</w:t>
+      </w:r>
+    </w:p>
+    <w:p>
+      <w:r>
+        <w:t>│   ├── repairs.ts            # Repair ticket lifecycle</w:t>
+      </w:r>
+    </w:p>
+    <w:p>
+      <w:r>
+        <w:t>│   ├── permissions.ts        # Role-based permissions</w:t>
+      </w:r>
+    </w:p>
+    <w:p>
+      <w:r>
+        <w:t>│   ├── upload.ts             # Multer image upload (Cloudinary production / disk dev)</w:t>
+      </w:r>
+    </w:p>
+    <w:p>
+      <w:r>
+        <w:t>│   ├── mpesa.ts              # Daraja API STK Push</w:t>
+      </w:r>
+    </w:p>
+    <w:p>
+      <w:r>
+        <w:t>│   ├── email.ts              # Unified email transporter</w:t>
+      </w:r>
+    </w:p>
+    <w:p>
+      <w:r>
+        <w:t>│   ├── notify.ts             # Email notification helpers</w:t>
+      </w:r>
+    </w:p>
+    <w:p>
+      <w:r>
+        <w:t>│   └── routes/shared.ts      # asyncHandler, escapeHtml, validation helpers, invoice templates</w:t>
+      </w:r>
+    </w:p>
+    <w:p>
+      <w:r>
+        <w:t>├── control-plane/            # Operator dashboard (Express + own Neon DB)</w:t>
+      </w:r>
+    </w:p>
+    <w:p>
+      <w:r>
+        <w:t>│   ├── server/               # index.ts, provision.ts (Neon/Render/Vercel/Cloudflare), db.ts</w:t>
+      </w:r>
+    </w:p>
+    <w:p>
+      <w:r>
+        <w:t>│   └── public/               # Static dashboard (HTML/JS) incl. feature-override picker</w:t>
+      </w:r>
+    </w:p>
+    <w:p>
+      <w:r>
+        <w:t>├── render.yaml               # Render.com deployment config</w:t>
+      </w:r>
+    </w:p>
+    <w:p>
+      <w:r>
+        <w:t>├── vercel.json               # Vercel deployment config</w:t>
+      </w:r>
+    </w:p>
+    <w:p>
+      <w:r>
+        <w:t>└── README.md                 # Main project documentation</w:t>
       </w:r>
     </w:p>
     <w:p>
@@ -251,19 +513,81 @@
     </w:p>
     <w:p/>
     <w:p>
+      <w:r>
+        <w:t>---</w:t>
+      </w:r>
+    </w:p>
+    <w:p/>
+    <w:p>
+      <w:pPr>
+        <w:pStyle w:val="Heading2"/>
+      </w:pPr>
+      <w:r>
+        <w:t>4. How the Application Starts</w:t>
+      </w:r>
+    </w:p>
+    <w:p/>
+    <w:p>
       <w:pPr>
         <w:pStyle w:val="Heading3"/>
       </w:pPr>
       <w:r>
-        <w:t>Main components</w:t>
-      </w:r>
-    </w:p>
+        <w:t>Local setup</w:t>
+      </w:r>
+    </w:p>
+    <w:p/>
+    <w:p>
+      <w:r>
+        <w:t>1. Install PostgreSQL and create a database (`laptop_sale`).</w:t>
+      </w:r>
+    </w:p>
+    <w:p>
+      <w:r>
+        <w:t>2. `npm install` at the root, then `cd frontend &amp;&amp; npm install`.</w:t>
+      </w:r>
+    </w:p>
+    <w:p>
+      <w:r>
+        <w:t>3. `copy .env.example .env` and set `DATABASE_URL`, `JWT_SECRET`, `ADMIN_PASSWORD`, `TECH_PASSWORD`.</w:t>
+      </w:r>
+    </w:p>
+    <w:p>
+      <w:r>
+        <w:t>4. Start everything: `npm run dev:all`</w:t>
+      </w:r>
+    </w:p>
+    <w:p>
+      <w:r>
+        <w:t xml:space="preserve">   - Backend: `http://localhost:8020`</w:t>
+      </w:r>
+    </w:p>
+    <w:p>
+      <w:r>
+        <w:t xml:space="preserve">   - Frontend: `http://localhost:3000`</w:t>
+      </w:r>
+    </w:p>
+    <w:p/>
+    <w:p>
+      <w:r>
+        <w:t>See `LOCAL_SETUP.md` for the detailed step-by-step guide.</w:t>
+      </w:r>
+    </w:p>
+    <w:p/>
+    <w:p>
+      <w:pPr>
+        <w:pStyle w:val="Heading3"/>
+      </w:pPr>
+      <w:r>
+        <w:t>Default URLs (dev)</w:t>
+      </w:r>
+    </w:p>
+    <w:p/>
     <w:p>
       <w:pPr>
         <w:pStyle w:val="ListBullet"/>
       </w:pPr>
       <w:r>
-        <w:t>`account.html` / `account.js` — customer login, repair portal, ticket list, notifications.</w:t>
+        <w:t>`http://localhost:3000` — storefront homepage.</w:t>
       </w:r>
     </w:p>
     <w:p>
@@ -271,7 +595,7 @@
         <w:pStyle w:val="ListBullet"/>
       </w:pPr>
       <w:r>
-        <w:t>`customer-auth.js` — shared customer auth helpers and API wrapper.</w:t>
+        <w:t>`http://localhost:3000/login` — unified login (customer / staff / provider; Google Sign-In supported).</w:t>
       </w:r>
     </w:p>
     <w:p>
@@ -279,7 +603,7 @@
         <w:pStyle w:val="ListBullet"/>
       </w:pPr>
       <w:r>
-        <w:t>`backoffice/` — staff repair management interface.</w:t>
+        <w:t>`http://localhost:3000/admin` — unified staff portal (admin / owner / manager / technician / staff).</w:t>
       </w:r>
     </w:p>
     <w:p>
@@ -287,7 +611,31 @@
         <w:pStyle w:val="ListBullet"/>
       </w:pPr>
       <w:r>
-        <w:t>`admin/` — admin product management interface.</w:t>
+        <w:t>`http://localhost:4000` — control plane dashboard (separate app).</w:t>
+      </w:r>
+    </w:p>
+    <w:p/>
+    <w:p>
+      <w:r>
+        <w:t>---</w:t>
+      </w:r>
+    </w:p>
+    <w:p/>
+    <w:p>
+      <w:pPr>
+        <w:pStyle w:val="Heading2"/>
+      </w:pPr>
+      <w:r>
+        <w:t>5. Main User Roles</w:t>
+      </w:r>
+    </w:p>
+    <w:p/>
+    <w:p>
+      <w:pPr>
+        <w:pStyle w:val="Heading3"/>
+      </w:pPr>
+      <w:r>
+        <w:t>Customer</w:t>
       </w:r>
     </w:p>
     <w:p>
@@ -295,7 +643,7 @@
         <w:pStyle w:val="ListBullet"/>
       </w:pPr>
       <w:r>
-        <w:t>`server/` — backend API, data access, repair logic, auth, and uploads.</w:t>
+        <w:t>Browse products, search, filter by category/subcategory.</w:t>
       </w:r>
     </w:p>
     <w:p>
@@ -303,11 +651,136 @@
         <w:pStyle w:val="ListBullet"/>
       </w:pPr>
       <w:r>
-        <w:t>`data/` — persistence storage for the SQLite DB and uploaded images.</w:t>
+        <w:t>Add to cart, wishlist, request quotes.</w:t>
+      </w:r>
+    </w:p>
+    <w:p>
+      <w:pPr>
+        <w:pStyle w:val="ListBullet"/>
+      </w:pPr>
+      <w:r>
+        <w:t>Two-step checkout with delivery details (47 Kenyan counties) and M-Pesa payment.</w:t>
+      </w:r>
+    </w:p>
+    <w:p>
+      <w:pPr>
+        <w:pStyle w:val="ListBullet"/>
+      </w:pPr>
+      <w:r>
+        <w:t>Track orders, download invoices (shipped/delivered), book and track repairs, message providers, review products (1–5 stars).</w:t>
       </w:r>
     </w:p>
     <w:p/>
     <w:p>
+      <w:pPr>
+        <w:pStyle w:val="Heading3"/>
+      </w:pPr>
+      <w:r>
+        <w:t>Staff (technician / manager / role-based)</w:t>
+      </w:r>
+    </w:p>
+    <w:p>
+      <w:pPr>
+        <w:pStyle w:val="ListBullet"/>
+      </w:pPr>
+      <w:r>
+        <w:t>Log in to the unified staff portal at `/admin`.</w:t>
+      </w:r>
+    </w:p>
+    <w:p>
+      <w:pPr>
+        <w:pStyle w:val="ListBullet"/>
+      </w:pPr>
+      <w:r>
+        <w:t>Manage repair tickets (assign, status, notes, parts, cost estimates sent to customers).</w:t>
+      </w:r>
+    </w:p>
+    <w:p>
+      <w:pPr>
+        <w:pStyle w:val="ListBullet"/>
+      </w:pPr>
+      <w:r>
+        <w:t>What the sidebar shows depends on the user's effective permissions (base role + assigned custom roles + direct per-user permissions): technicians and staff see Dashboard + Repairs; managers additionally get Products, Orders, Customers, Quotations, Invoices, Credit Notes, Reports, Messages, and Stock; owners get business oversight on top.</w:t>
+      </w:r>
+    </w:p>
+    <w:p/>
+    <w:p>
+      <w:pPr>
+        <w:pStyle w:val="Heading3"/>
+      </w:pPr>
+      <w:r>
+        <w:t>Provider</w:t>
+      </w:r>
+    </w:p>
+    <w:p>
+      <w:pPr>
+        <w:pStyle w:val="ListBullet"/>
+      </w:pPr>
+      <w:r>
+        <w:t>Log in to the unified staff portal at `/admin` (provider role, added by an admin from **Users &amp; Permissions**).</w:t>
+      </w:r>
+    </w:p>
+    <w:p>
+      <w:pPr>
+        <w:pStyle w:val="ListBullet"/>
+      </w:pPr>
+      <w:r>
+        <w:t>What the provider sees is driven by their assigned permissions (e.g. repairs, products, stock, calendar, order viewing, messaging). External provider accounts without staff permissions no longer have a separate portal.</w:t>
+      </w:r>
+    </w:p>
+    <w:p/>
+    <w:p>
+      <w:pPr>
+        <w:pStyle w:val="Heading3"/>
+      </w:pPr>
+      <w:r>
+        <w:t>Admin</w:t>
+      </w:r>
+    </w:p>
+    <w:p>
+      <w:pPr>
+        <w:pStyle w:val="ListBullet"/>
+      </w:pPr>
+      <w:r>
+        <w:t>Superuser in `/admin`: every section — products, categories, orders, staff, roles, plans, providers, invoices, credit notes, coupons, reports, stock, branches, clients, splashes, reviews, messages, settings, storefront layouts.</w:t>
+      </w:r>
+    </w:p>
+    <w:p/>
+    <w:p>
+      <w:pPr>
+        <w:pStyle w:val="Heading3"/>
+      </w:pPr>
+      <w:r>
+        <w:t>Owner</w:t>
+      </w:r>
+    </w:p>
+    <w:p>
+      <w:pPr>
+        <w:pStyle w:val="ListBullet"/>
+      </w:pPr>
+      <w:r>
+        <w:t>Business oversight in `/admin` (owner role): dashboard, products, customers, messages, quotes, reports, stock control, tech repairs, about us, storefront, shop subscription, audit log. Everything except Users, Roles, Plans, Settings, Storefront, and Purchases. Feature-gated by subscription plan.</w:t>
+      </w:r>
+    </w:p>
+    <w:p/>
+    <w:p>
+      <w:pPr>
+        <w:pStyle w:val="Heading3"/>
+      </w:pPr>
+      <w:r>
+        <w:t>Control Plane Operator (Gear&amp;Glitch team)</w:t>
+      </w:r>
+    </w:p>
+    <w:p>
+      <w:pPr>
+        <w:pStyle w:val="ListBullet"/>
+      </w:pPr>
+      <w:r>
+        <w:t>Log in to the control plane dashboard: provision clients, monitor health, manage plans/subscriptions/invoices, deploy updates, run backups, configure SMTP/Cloudinary, and fine-tune per-client features.</w:t>
+      </w:r>
+    </w:p>
+    <w:p/>
+    <w:p>
       <w:r>
         <w:t>---</w:t>
       </w:r>
@@ -318,7 +791,7 @@
         <w:pStyle w:val="Heading2"/>
       </w:pPr>
       <w:r>
-        <w:t>3. What Each Folder Contains</w:t>
+        <w:t>6. Key Panels</w:t>
       </w:r>
     </w:p>
     <w:p/>
@@ -327,7 +800,27 @@
         <w:pStyle w:val="Heading3"/>
       </w:pPr>
       <w:r>
-        <w:t>Root-level pages</w:t>
+        <w:t>Staff Portal (`/admin`)</w:t>
+      </w:r>
+    </w:p>
+    <w:p>
+      <w:r>
+        <w:t>One unified, role-aware portal replaces the former separate `/admin`, `/owner`, and `/backoffice` pages. The sidebar shows exactly what the signed-in user's permissions allow; feature gating hides sections the active plan doesn't include. Sections include: Dashboard, Products, **Groups**, Categories, **Category Order**, **Repairs** (Services: Tickets, Calendar, Page Content), Coupons, Gift Cards, Campaigns, Abandoned Carts, Orders, Users &amp; Permissions, Roles, Plans, Providers, Invoices, Credit Notes, Reports (5 sub-tabs), Stock on Hand, Stock Transfers, Stock Take, Purchases, Suppliers, Branches, Clients, Messages, Reviews, Spec Templates, Splashes, About Us, Storefront, Shop Subscription, Settings.</w:t>
+      </w:r>
+    </w:p>
+    <w:p/>
+    <w:p>
+      <w:r>
+        <w:t>Access is fine-tuned in **Users &amp; Permissions** (assign/remove roles per user, toggle direct permissions) and **Roles** (define custom roles with granular permission toggles — every sidebar view maps to a permission such as `order:view`, `customer:view`, `invoice:view`, `reports:view`, `stock:list`, or `messaging:view`).</w:t>
+      </w:r>
+    </w:p>
+    <w:p/>
+    <w:p>
+      <w:pPr>
+        <w:pStyle w:val="Heading3"/>
+      </w:pPr>
+      <w:r>
+        <w:t>Customer management (Admin → Customers)</w:t>
       </w:r>
     </w:p>
     <w:p>
@@ -335,7 +828,7 @@
         <w:pStyle w:val="ListBullet"/>
       </w:pPr>
       <w:r>
-        <w:t>`index.html` — shop home.</w:t>
+        <w:t>**Edit a customer** — the **Edit** button on any customer row opens an inline panel to update name, email, and phone, or set a new password (leave blank to keep the current password). A duplicate email is rejected with a clear error.</w:t>
       </w:r>
     </w:p>
     <w:p>
@@ -343,7 +836,92 @@
         <w:pStyle w:val="ListBullet"/>
       </w:pPr>
       <w:r>
-        <w:t>`cart.html` — cart interface.</w:t>
+        <w:t>**Delete a customer** — deleting a customer also removes all their dependent records in one transaction: repair tickets (with their parts, updates, and images), messages, product reviews, loyalty points and transactions, coupon usage, credit notes, eTIMS sales records, orders (with items, invoices, gift-card redemptions, refunds), carts, wishlist, quotes, and cart-recovery reminders. Every customer can be deleted regardless of history — but deletion is permanent and cannot be undone.</w:t>
+      </w:r>
+    </w:p>
+    <w:p/>
+    <w:p>
+      <w:pPr>
+        <w:pStyle w:val="Heading3"/>
+      </w:pPr>
+      <w:r>
+        <w:t>Control Plane Dashboard</w:t>
+      </w:r>
+    </w:p>
+    <w:p>
+      <w:r>
+        <w:t>Clients, Plans, Changelog, Deploy Log, Backups, Settings (SMTP/Cloudinary), Audit Log, Users (with 2FA), plus a **notification bell** (unread badge + dropdown) and a **payment-reminders banner** on the Clients tab.</w:t>
+      </w:r>
+    </w:p>
+    <w:p/>
+    <w:p>
+      <w:r>
+        <w:t>---</w:t>
+      </w:r>
+    </w:p>
+    <w:p/>
+    <w:p>
+      <w:pPr>
+        <w:pStyle w:val="Heading2"/>
+      </w:pPr>
+      <w:r>
+        <w:t>7. Storefront</w:t>
+      </w:r>
+    </w:p>
+    <w:p/>
+    <w:p>
+      <w:pPr>
+        <w:pStyle w:val="Heading3"/>
+      </w:pPr>
+      <w:r>
+        <w:t>Layouts</w:t>
+      </w:r>
+    </w:p>
+    <w:p>
+      <w:r>
+        <w:t>Five built-in layout themes — Original, Amazon, Jumia, Mobile, Custom — plus a runtime JSON layout builder for admin-created dynamic themes. The active layout is stored in the `storefront_layouts` table and selected from Admin → Settings → Storefront.</w:t>
+      </w:r>
+    </w:p>
+    <w:p/>
+    <w:p>
+      <w:pPr>
+        <w:pStyle w:val="Heading3"/>
+      </w:pPr>
+      <w:r>
+        <w:t>Product Groups</w:t>
+      </w:r>
+    </w:p>
+    <w:p>
+      <w:r>
+        <w:t>Managed collections built from the old free-text category groups (`product_groups` table). Admins create/edit/delete groups and toggle each one **active** from Admin → Groups. Active groups get public `/groups` (index) and `/group/[slug]` (product grid) pages, and appear as filters in the Sales Report and Stock Summary. Products assign to a group via the product form's Group dropdown; category remains optional. Existing category group names were migrated into group rows automatically, and `products.group_id` was backfilled from each product's category.</w:t>
+      </w:r>
+    </w:p>
+    <w:p/>
+    <w:p>
+      <w:pPr>
+        <w:pStyle w:val="Heading3"/>
+      </w:pPr>
+      <w:r>
+        <w:t>Repairs page content</w:t>
+      </w:r>
+    </w:p>
+    <w:p>
+      <w:r>
+        <w:t>The public `/repairs` page is fully editable from **Admin → Services → Repairs → Page Content**: change the intro paragraph and add/remove/edit the service panels (title + description) customers see. Each panel can be hidden without deleting it (untick **Show on the /repairs page**) or turned into a **booking button**: tick **Booking button**, then set a repair type (for automatic base pricing), a device type to pre-fill, a default issue description, and symptoms to pre-check. Clicking that panel on the storefront opens `/repair-book` with those fields already filled — the customer just confirms and submits, and the ticket is created with the linked repair type so a quote is calculated immediately. Content is saved in settings and served to the storefront via `GET /api/repairs-page` (falls back to the default panels if nothing has been saved yet).</w:t>
+      </w:r>
+    </w:p>
+    <w:p/>
+    <w:p>
+      <w:pPr>
+        <w:pStyle w:val="Heading3"/>
+      </w:pPr>
+      <w:r>
+        <w:t>Header navigation &amp; hero chips stay in sync with categories</w:t>
+      </w:r>
+    </w:p>
+    <w:p>
+      <w:r>
+        <w:t>The storefront header nav buttons (next to the Sign in button) and the hero's category chips are reconciled against the live category list on every load — no manual "sync" step needed:</w:t>
       </w:r>
     </w:p>
     <w:p>
@@ -351,7 +929,7 @@
         <w:pStyle w:val="ListBullet"/>
       </w:pPr>
       <w:r>
-        <w:t>`product.html` — product detail page.</w:t>
+        <w:t>**Deleted categories** are automatically removed from the header nav and hero chips.</w:t>
       </w:r>
     </w:p>
     <w:p>
@@ -359,7 +937,7 @@
         <w:pStyle w:val="ListBullet"/>
       </w:pPr>
       <w:r>
-        <w:t>`repair-book.html` — request a repair.</w:t>
+        <w:t>**Newly added categories** are automatically appended to both.</w:t>
       </w:r>
     </w:p>
     <w:p>
@@ -367,7 +945,7 @@
         <w:pStyle w:val="ListBullet"/>
       </w:pPr>
       <w:r>
-        <w:t>`my-repairs.html` — view repair tickets.</w:t>
+        <w:t>Static page links (Repairs, Cart, Wishlist, About Us, Contact) are preserved, as is the admin-configured nav order for existing items.</w:t>
       </w:r>
     </w:p>
     <w:p>
@@ -375,7 +953,15 @@
         <w:pStyle w:val="ListBullet"/>
       </w:pPr>
       <w:r>
-        <w:t>`account.html` — account login/register and repair dashboard.</w:t>
+        <w:t>Cart, Wishlist, About Us and Contact display on the right side of the header, left of the search box. The "Groups" button is not shown in the storefront header (groups are still reachable at `/groups` and `/group/[slug]`).</w:t>
+      </w:r>
+    </w:p>
+    <w:p>
+      <w:pPr>
+        <w:pStyle w:val="ListBullet"/>
+      </w:pPr>
+      <w:r>
+        <w:t>The admin "Category Order" panel (drag-and-drop) still controls display order of the category grid.</w:t>
       </w:r>
     </w:p>
     <w:p/>
@@ -384,7 +970,12 @@
         <w:pStyle w:val="Heading3"/>
       </w:pPr>
       <w:r>
-        <w:t>`admin/`</w:t>
+        <w:t>Marketing hero (Original layout)</w:t>
+      </w:r>
+    </w:p>
+    <w:p>
+      <w:r>
+        <w:t>The hero section is fully admin-configurable from the Storefront panel and doubles as a conversion tool:</w:t>
       </w:r>
     </w:p>
     <w:p>
@@ -392,7 +983,7 @@
         <w:pStyle w:val="ListBullet"/>
       </w:pPr>
       <w:r>
-        <w:t>Admin product catalog management.</w:t>
+        <w:t>Sale countdown timer (auto-hides when the offer ends).</w:t>
       </w:r>
     </w:p>
     <w:p>
@@ -400,7 +991,7 @@
         <w:pStyle w:val="ListBullet"/>
       </w:pPr>
       <w:r>
-        <w:t>Add/edit/delete products and change stock or price.</w:t>
+        <w:t>Rotating headline/accent/subtitle variants (6s cycle).</w:t>
       </w:r>
     </w:p>
     <w:p>
@@ -408,7 +999,55 @@
         <w:pStyle w:val="ListBullet"/>
       </w:pPr>
       <w:r>
-        <w:t>Upload product images.</w:t>
+        <w:t>"Chat on WhatsApp" CTA (uses the store's phone number).</w:t>
+      </w:r>
+    </w:p>
+    <w:p>
+      <w:pPr>
+        <w:pStyle w:val="ListBullet"/>
+      </w:pPr>
+      <w:r>
+        <w:t>Payment &amp; delivery trust strip (M-Pesa &amp; cards, nationwide delivery, warranty).</w:t>
+      </w:r>
+    </w:p>
+    <w:p>
+      <w:pPr>
+        <w:pStyle w:val="ListBullet"/>
+      </w:pPr>
+      <w:r>
+        <w:t>Featured products with "Sale" badges, star ratings, "Only N left" scarcity notes, and Ken Burns zoom.</w:t>
+      </w:r>
+    </w:p>
+    <w:p>
+      <w:pPr>
+        <w:pStyle w:val="ListBullet"/>
+      </w:pPr>
+      <w:r>
+        <w:t>Category chips that auto-sync with the category list (deleted ones disappear, new ones appear).</w:t>
+      </w:r>
+    </w:p>
+    <w:p>
+      <w:pPr>
+        <w:pStyle w:val="ListBullet"/>
+      </w:pPr>
+      <w:r>
+        <w:t>Live stats that count up on load; logged-in customers see a personalized greeting.</w:t>
+      </w:r>
+    </w:p>
+    <w:p>
+      <w:pPr>
+        <w:pStyle w:val="ListBullet"/>
+      </w:pPr>
+      <w:r>
+        <w:t>Each booster has its own admin toggle (`showSearch`, `showTrustStrip`, `showWhatsApp`, etc.).</w:t>
+      </w:r>
+    </w:p>
+    <w:p>
+      <w:pPr>
+        <w:pStyle w:val="ListBullet"/>
+      </w:pPr>
+      <w:r>
+        <w:t>**Theme-aware background** — the hero background and text palette follow the visitor's device theme automatically: a light hero with dark text in light mode, the dark hero in dark mode. Admins can override either with custom color pickers (**Light theme background** / **Dark theme background**) in the hero form; leave them empty to keep following the device theme, and use "Reset to auto" to clear both. Text contrast is chosen automatically from the selected color (dark color → white text, light color → dark text).</w:t>
       </w:r>
     </w:p>
     <w:p/>
@@ -417,7 +1056,50 @@
         <w:pStyle w:val="Heading3"/>
       </w:pPr>
       <w:r>
-        <w:t>`backoffice/`</w:t>
+        <w:t>Theme</w:t>
+      </w:r>
+    </w:p>
+    <w:p>
+      <w:r>
+        <w:t>Dark mode by default with a light/dark toggle, persisted in `localStorage` and applied via `[data-theme]` CSS custom properties. All animations respect `prefers-reduced-motion`.</w:t>
+      </w:r>
+    </w:p>
+    <w:p/>
+    <w:p>
+      <w:pPr>
+        <w:pStyle w:val="Heading3"/>
+      </w:pPr>
+      <w:r>
+        <w:t>Empty-cart animations</w:t>
+      </w:r>
+    </w:p>
+    <w:p>
+      <w:r>
+        <w:t>The empty cart page shows an animated SVG scene of the brand's gear-headed character leaning over the cart and pointing into it while question marks rise out of the basket. In December a worried Santa gearhead (with an empty, drooping sack) joins it. Both are driven by CSS keyframes in `animations.css` (`EmptyCartAnimation.tsx`, `SantaGearAnimation.tsx`).</w:t>
+      </w:r>
+    </w:p>
+    <w:p/>
+    <w:p>
+      <w:r>
+        <w:t>---</w:t>
+      </w:r>
+    </w:p>
+    <w:p/>
+    <w:p>
+      <w:pPr>
+        <w:pStyle w:val="Heading2"/>
+      </w:pPr>
+      <w:r>
+        <w:t>8. Backend API Summary</w:t>
+      </w:r>
+    </w:p>
+    <w:p/>
+    <w:p>
+      <w:pPr>
+        <w:pStyle w:val="Heading3"/>
+      </w:pPr>
+      <w:r>
+        <w:t>Public (no auth)</w:t>
       </w:r>
     </w:p>
     <w:p>
@@ -425,7 +1107,7 @@
         <w:pStyle w:val="ListBullet"/>
       </w:pPr>
       <w:r>
-        <w:t>Staff-facing management of repair tickets.</w:t>
+        <w:t>`GET /api/health` — health check (usage stats only disclosed to the control plane).</w:t>
       </w:r>
     </w:p>
     <w:p>
@@ -433,7 +1115,47 @@
         <w:pStyle w:val="ListBullet"/>
       </w:pPr>
       <w:r>
-        <w:t>Technician workflow and calendar.</w:t>
+        <w:t>`GET /api/public-settings` — store name, phone, email, currency, logo, Google Client ID, M-Pesa till.</w:t>
+      </w:r>
+    </w:p>
+    <w:p>
+      <w:pPr>
+        <w:pStyle w:val="ListBullet"/>
+      </w:pPr>
+      <w:r>
+        <w:t>`GET /api/products`, `GET /api/products/:id`, `GET /api/products/:id/images`, `GET /api/products/:id/reviews`.</w:t>
+      </w:r>
+    </w:p>
+    <w:p>
+      <w:pPr>
+        <w:pStyle w:val="ListBullet"/>
+      </w:pPr>
+      <w:r>
+        <w:t>`GET /api/categories`, `GET /api/subcategories`.</w:t>
+      </w:r>
+    </w:p>
+    <w:p>
+      <w:pPr>
+        <w:pStyle w:val="ListBullet"/>
+      </w:pPr>
+      <w:r>
+        <w:t>`GET /api/plans`, `GET /api/layouts`, `GET /api/shipping/counties`, `GET /api/splashes`.</w:t>
+      </w:r>
+    </w:p>
+    <w:p>
+      <w:pPr>
+        <w:pStyle w:val="ListBullet"/>
+      </w:pPr>
+      <w:r>
+        <w:t>`GET /api/shop/features` — merged subscription + override features for UI gating.</w:t>
+      </w:r>
+    </w:p>
+    <w:p>
+      <w:pPr>
+        <w:pStyle w:val="ListBullet"/>
+      </w:pPr>
+      <w:r>
+        <w:t>`GET /api/repairs-page` — intro + service panels for the public `/repairs` page.</w:t>
       </w:r>
     </w:p>
     <w:p/>
@@ -442,7 +1164,7 @@
         <w:pStyle w:val="Heading3"/>
       </w:pPr>
       <w:r>
-        <w:t>`server/`</w:t>
+        <w:t>Customer</w:t>
       </w:r>
     </w:p>
     <w:p>
@@ -450,7 +1172,7 @@
         <w:pStyle w:val="ListBullet"/>
       </w:pPr>
       <w:r>
-        <w:t>`index.js` — Express app entry point and route registration.</w:t>
+        <w:t>`POST /api/customer/login`, `POST /api/customer/google-login`.</w:t>
       </w:r>
     </w:p>
     <w:p>
@@ -458,7 +1180,7 @@
         <w:pStyle w:val="ListBullet"/>
       </w:pPr>
       <w:r>
-        <w:t>`db.js` — SQLite database functions and queries.</w:t>
+        <w:t>`GET/POST /api/orders`, `GET /api/orders/:id`, `GET /api/orders/:id/invoice`, `POST /api/orders/create-pending`, `PATCH /api/orders/:id`.</w:t>
       </w:r>
     </w:p>
     <w:p>
@@ -466,7 +1188,7 @@
         <w:pStyle w:val="ListBullet"/>
       </w:pPr>
       <w:r>
-        <w:t>`auth.js` — authentication for customers, staff, and admins.</w:t>
+        <w:t>`POST /api/cart`, `PATCH/DELETE /api/cart/:productId`.</w:t>
       </w:r>
     </w:p>
     <w:p>
@@ -474,7 +1196,7 @@
         <w:pStyle w:val="ListBullet"/>
       </w:pPr>
       <w:r>
-        <w:t>`repairs.js` — repair ticket creation, listing, and update business logic.</w:t>
+        <w:t>`POST /api/wishlist`, `POST /api/quotes/from-wishlist`.</w:t>
       </w:r>
     </w:p>
     <w:p>
@@ -482,7 +1204,7 @@
         <w:pStyle w:val="ListBullet"/>
       </w:pPr>
       <w:r>
-        <w:t>`notify.js` — email notification helper.</w:t>
+        <w:t>`POST /api/repairs`, `GET /api/repairs/mine`, `POST /api/repairs/mine/:id/message`, `POST /api/repairs/:id/quote-response`.</w:t>
       </w:r>
     </w:p>
     <w:p>
@@ -490,11 +1212,103 @@
         <w:pStyle w:val="ListBullet"/>
       </w:pPr>
       <w:r>
-        <w:t>`upload.js` — product image upload handling.</w:t>
+        <w:t>`POST /api/products/:id/reviews`, `PUT/DELETE` review endpoints, `GET .../reviews/check`.</w:t>
+      </w:r>
+    </w:p>
+    <w:p>
+      <w:pPr>
+        <w:pStyle w:val="ListBullet"/>
+      </w:pPr>
+      <w:r>
+        <w:t>`GET/POST /api/messages`.</w:t>
       </w:r>
     </w:p>
     <w:p/>
     <w:p>
+      <w:pPr>
+        <w:pStyle w:val="Heading3"/>
+      </w:pPr>
+      <w:r>
+        <w:t>Staff</w:t>
+      </w:r>
+    </w:p>
+    <w:p>
+      <w:pPr>
+        <w:pStyle w:val="ListBullet"/>
+      </w:pPr>
+      <w:r>
+        <w:t>`POST /api/auth/login`, `GET /api/auth/me`, `POST /api/auth/change-password`.</w:t>
+      </w:r>
+    </w:p>
+    <w:p>
+      <w:pPr>
+        <w:pStyle w:val="ListBullet"/>
+      </w:pPr>
+      <w:r>
+        <w:t>Repair, stock, stock-transfer, stock-take, report, audit-log, and subscription endpoints (permission-gated).</w:t>
+      </w:r>
+    </w:p>
+    <w:p/>
+    <w:p>
+      <w:pPr>
+        <w:pStyle w:val="Heading3"/>
+      </w:pPr>
+      <w:r>
+        <w:t>Admin</w:t>
+      </w:r>
+    </w:p>
+    <w:p>
+      <w:pPr>
+        <w:pStyle w:val="ListBullet"/>
+      </w:pPr>
+      <w:r>
+        <w:t>Full CRUD for products, categories, staff, roles, plans, providers, orders, invoices, coupons, suppliers, branches, settings, splashes, storefront layouts, about-us content.</w:t>
+      </w:r>
+    </w:p>
+    <w:p/>
+    <w:p>
+      <w:pPr>
+        <w:pStyle w:val="Heading3"/>
+      </w:pPr>
+      <w:r>
+        <w:t>Provider</w:t>
+      </w:r>
+    </w:p>
+    <w:p>
+      <w:pPr>
+        <w:pStyle w:val="ListBullet"/>
+      </w:pPr>
+      <w:r>
+        <w:t>`GET /api/provider/orders`, `GET /api/provider/orders/:id`, `PATCH .../items/:itemId/cancel`, `PATCH .../status`.</w:t>
+      </w:r>
+    </w:p>
+    <w:p/>
+    <w:p>
+      <w:pPr>
+        <w:pStyle w:val="Heading3"/>
+      </w:pPr>
+      <w:r>
+        <w:t>Control plane (authenticated with `x-control-plane-key`)</w:t>
+      </w:r>
+    </w:p>
+    <w:p>
+      <w:pPr>
+        <w:pStyle w:val="ListBullet"/>
+      </w:pPr>
+      <w:r>
+        <w:t>`POST /api/admin/features/overrides` — push per-client feature overrides.</w:t>
+      </w:r>
+    </w:p>
+    <w:p>
+      <w:pPr>
+        <w:pStyle w:val="ListBullet"/>
+      </w:pPr>
+      <w:r>
+        <w:t>`PUT /api/plans/sync`, `GET /api/cloudinary-config`, `POST /api/control-plane/suspend|resume|redeploy`, `GET /api/control-plane/trigger-backup`.</w:t>
+      </w:r>
+    </w:p>
+    <w:p/>
+    <w:p>
       <w:r>
         <w:t>---</w:t>
       </w:r>
@@ -505,36 +1319,79 @@
         <w:pStyle w:val="Heading2"/>
       </w:pPr>
       <w:r>
-        <w:t>4. How the Application Starts</w:t>
+        <w:t>9. How Data is Stored</w:t>
       </w:r>
     </w:p>
     <w:p/>
     <w:p>
       <w:pPr>
+        <w:pStyle w:val="ListBullet"/>
+      </w:pPr>
+      <w:r>
+        <w:t>One **PostgreSQL database per client** (created on Neon by the control plane).</w:t>
+      </w:r>
+    </w:p>
+    <w:p>
+      <w:pPr>
+        <w:pStyle w:val="ListBullet"/>
+      </w:pPr>
+      <w:r>
+        <w:t>Backend creates all tables on first boot from `server/schema.sql` and applies migrations.</w:t>
+      </w:r>
+    </w:p>
+    <w:p>
+      <w:pPr>
+        <w:pStyle w:val="ListBullet"/>
+      </w:pPr>
+      <w:r>
+        <w:t>Settings are stored in a `settings` key/value table; the store name defaults to `STORE_NAME` env (or "Gear&amp;Glitch").</w:t>
+      </w:r>
+    </w:p>
+    <w:p>
+      <w:pPr>
+        <w:pStyle w:val="ListBullet"/>
+      </w:pPr>
+      <w:r>
+        <w:t>Images are stored on **Cloudinary** in production (per-client folder `gear-glitch/{client-slug}`), with optional base64 database backup via the `stored_images` table, and local disk in dev (`data/uploads/`).</w:t>
+      </w:r>
+    </w:p>
+    <w:p/>
+    <w:p>
+      <w:r>
+        <w:t>---</w:t>
+      </w:r>
+    </w:p>
+    <w:p/>
+    <w:p>
+      <w:pPr>
+        <w:pStyle w:val="Heading2"/>
+      </w:pPr>
+      <w:r>
+        <w:t>10. Repair Workflow</w:t>
+      </w:r>
+    </w:p>
+    <w:p/>
+    <w:p>
+      <w:pPr>
         <w:pStyle w:val="Heading3"/>
       </w:pPr>
       <w:r>
-        <w:t>Setup steps</w:t>
-      </w:r>
-    </w:p>
-    <w:p>
-      <w:r>
-        <w:t>1. Run `npm install`.</w:t>
-      </w:r>
-    </w:p>
-    <w:p>
-      <w:r>
-        <w:t>2. Copy `.env.example` to `.env`.</w:t>
-      </w:r>
-    </w:p>
-    <w:p>
-      <w:r>
-        <w:t>3. Set your environment values, such as `PORT`, `JWT_SECRET`, `ADMIN_USERNAME`, `ADMIN_PASSWORD`.</w:t>
-      </w:r>
-    </w:p>
-    <w:p>
-      <w:r>
-        <w:t>4. Start the app with `npm start`.</w:t>
+        <w:t>Customer side</w:t>
+      </w:r>
+    </w:p>
+    <w:p>
+      <w:r>
+        <w:t>1. Book a repair via `/repair-book`.</w:t>
+      </w:r>
+    </w:p>
+    <w:p>
+      <w:r>
+        <w:t>2. Backend creates a ticket.</w:t>
+      </w:r>
+    </w:p>
+    <w:p>
+      <w:r>
+        <w:t>3. Track ticket list in `/my-repairs`; view cost estimates with Accept/Decline and message the shop.</w:t>
       </w:r>
     </w:p>
     <w:p/>
@@ -543,7 +1400,60 @@
         <w:pStyle w:val="Heading3"/>
       </w:pPr>
       <w:r>
-        <w:t>Default URLs</w:t>
+        <w:t>Staff side</w:t>
+      </w:r>
+    </w:p>
+    <w:p>
+      <w:r>
+        <w:t>1. Manage tickets in `/admin` → Services → Repairs (assign technician, status, notes, parts, images).</w:t>
+      </w:r>
+    </w:p>
+    <w:p>
+      <w:r>
+        <w:t>2. Send cost estimates to customers; the customer's response updates the ticket.</w:t>
+      </w:r>
+    </w:p>
+    <w:p/>
+    <w:p>
+      <w:r>
+        <w:t>---</w:t>
+      </w:r>
+    </w:p>
+    <w:p/>
+    <w:p>
+      <w:pPr>
+        <w:pStyle w:val="Heading2"/>
+      </w:pPr>
+      <w:r>
+        <w:t>11. Feature Flags &amp; Per-Client Overrides</w:t>
+      </w:r>
+    </w:p>
+    <w:p/>
+    <w:p>
+      <w:pPr>
+        <w:pStyle w:val="Heading3"/>
+      </w:pPr>
+      <w:r>
+        <w:t>Subscription plan features</w:t>
+      </w:r>
+    </w:p>
+    <w:p>
+      <w:r>
+        <w:t>Plans carry 51+ feature flags organized into 11 groups (Core Commerce, Inventory &amp; Stock, Invoicing &amp; Finance, Repairs &amp; Service, Customer Engagement, WhatsApp &amp; Communication, Multi-Location, Marketing &amp; Storefront, Analytics &amp; Security, Support &amp; Account, Payments &amp; Currency). Recent additions include Gift cards, Campaign pages, and Cart recovery. The frontend `useFeature()` hook shows/hides nav items and UI sections; server middleware enforces plan features on APIs.</w:t>
+      </w:r>
+    </w:p>
+    <w:p/>
+    <w:p>
+      <w:pPr>
+        <w:pStyle w:val="Heading3"/>
+      </w:pPr>
+      <w:r>
+        <w:t>Control-plane overrides</w:t>
+      </w:r>
+    </w:p>
+    <w:p>
+      <w:r>
+        <w:t>From the control plane **Edit Client** modal, the operator can override a tenant's feature set without touching the plan:</w:t>
       </w:r>
     </w:p>
     <w:p>
@@ -551,7 +1461,7 @@
         <w:pStyle w:val="ListBullet"/>
       </w:pPr>
       <w:r>
-        <w:t>`http://localhost:3000` — store homepage.</w:t>
+        <w:t>**Enabled** (blue) — force-adds a feature the plan doesn't include.</w:t>
       </w:r>
     </w:p>
     <w:p>
@@ -559,7 +1469,7 @@
         <w:pStyle w:val="ListBullet"/>
       </w:pPr>
       <w:r>
-        <w:t>`http://localhost:3000/account.html` — customer login/register and repair portal.</w:t>
+        <w:t>**Blocked** (red, struck through) — hides a feature the plan normally includes.</w:t>
       </w:r>
     </w:p>
     <w:p>
@@ -567,7 +1477,7 @@
         <w:pStyle w:val="ListBullet"/>
       </w:pPr>
       <w:r>
-        <w:t>`http://localhost:3000/repair-book.html` — repair booking form.</w:t>
+        <w:t>**Inherit** (neutral dash) — falls back to the plan's defaults.</w:t>
       </w:r>
     </w:p>
     <w:p>
@@ -575,7 +1485,7 @@
         <w:pStyle w:val="ListBullet"/>
       </w:pPr>
       <w:r>
-        <w:t>`http://localhost:3000/backoffice/` — staff backoffice.</w:t>
+        <w:t>Group **Select all** / **Block** buttons and a **Clear overrides** button.</w:t>
       </w:r>
     </w:p>
     <w:p>
@@ -583,7 +1493,7 @@
         <w:pStyle w:val="ListBullet"/>
       </w:pPr>
       <w:r>
-        <w:t>`http://localhost:3000/admin/` — product administration panel.</w:t>
+        <w:t>Saving pushes the overrides to the client backend, which merges them with plan features on `GET /api/shop/features`.</w:t>
       </w:r>
     </w:p>
     <w:p/>
@@ -598,24 +1508,208 @@
         <w:pStyle w:val="Heading2"/>
       </w:pPr>
       <w:r>
-        <w:t>5. Main User Roles</w:t>
+        <w:t>12. Store Identity (Tab Title, Branding)</w:t>
       </w:r>
     </w:p>
     <w:p/>
     <w:p>
       <w:pPr>
+        <w:pStyle w:val="ListBullet"/>
+      </w:pPr>
+      <w:r>
+        <w:t>The browser tab title, `og:site_name`, and `og:title` use the store's `settings.storeName`, falling back to a neutral "Welcome to our store" placeholder so no client ever displays another tenant's brand.</w:t>
+      </w:r>
+    </w:p>
+    <w:p>
+      <w:pPr>
+        <w:pStyle w:val="ListBullet"/>
+      </w:pPr>
+      <w:r>
+        <w:t>`frontend/lib/app-context.tsx` sets `document.title` to the real store name once settings load.</w:t>
+      </w:r>
+    </w:p>
+    <w:p>
+      <w:pPr>
+        <w:pStyle w:val="ListBullet"/>
+      </w:pPr>
+      <w:r>
+        <w:t>New clients provisioned by the control plane get `STORE_NAME=&lt;client name&gt;` injected as a Render env var, and the backend seeds that name on first boot.</w:t>
+      </w:r>
+    </w:p>
+    <w:p>
+      <w:pPr>
+        <w:pStyle w:val="ListBullet"/>
+      </w:pPr>
+      <w:r>
+        <w:t>Existing clients that were seeded before this fix should set their store name in **Admin → Settings → Store Info** once.</w:t>
+      </w:r>
+    </w:p>
+    <w:p/>
+    <w:p>
+      <w:r>
+        <w:t>---</w:t>
+      </w:r>
+    </w:p>
+    <w:p/>
+    <w:p>
+      <w:pPr>
+        <w:pStyle w:val="Heading2"/>
+      </w:pPr>
+      <w:r>
+        <w:t>13. Control Plane</w:t>
+      </w:r>
+    </w:p>
+    <w:p/>
+    <w:p>
+      <w:r>
+        <w:t>The control plane (`control-plane/`, port 4000, own Neon DB) is the operator hub:</w:t>
+      </w:r>
+    </w:p>
+    <w:p/>
+    <w:p>
+      <w:pPr>
+        <w:pStyle w:val="ListBullet"/>
+      </w:pPr>
+      <w:r>
+        <w:t>**Clients** — provision (Neon + Render + Vercel), suspend/resume, redeploy, delete; health + uptime monitoring every 5 minutes; per-client feature overrides.</w:t>
+      </w:r>
+    </w:p>
+    <w:p>
+      <w:pPr>
+        <w:pStyle w:val="ListBullet"/>
+      </w:pPr>
+      <w:r>
+        <w:t>**Plans** — create/edit/activate/deactivate custom plans; sync to all clients.</w:t>
+      </w:r>
+    </w:p>
+    <w:p>
+      <w:pPr>
+        <w:pStyle w:val="ListBullet"/>
+      </w:pPr>
+      <w:r>
+        <w:t>**Changelog** — publish updates with email notifications to active clients.</w:t>
+      </w:r>
+    </w:p>
+    <w:p>
+      <w:pPr>
+        <w:pStyle w:val="ListBullet"/>
+      </w:pPr>
+      <w:r>
+        <w:t>**Backups** — `pg_dump` backups with UI download.</w:t>
+      </w:r>
+    </w:p>
+    <w:p>
+      <w:pPr>
+        <w:pStyle w:val="ListBullet"/>
+      </w:pPr>
+      <w:r>
+        <w:t>**Settings** — SMTP and Cloudinary configuration stored in DB.</w:t>
+      </w:r>
+    </w:p>
+    <w:p>
+      <w:pPr>
+        <w:pStyle w:val="ListBullet"/>
+      </w:pPr>
+      <w:r>
+        <w:t>**Invoices** — subscription invoicing: generate, **record payment** (one step: generate + mark paid + extend expiry + set next payment date + compute balance + auto-resume), view HTML/PDF, and email via the control plane's own SMTP.</w:t>
+      </w:r>
+    </w:p>
+    <w:p>
+      <w:pPr>
+        <w:pStyle w:val="ListBullet"/>
+      </w:pPr>
+      <w:r>
+        <w:t>**Payment reminders** — the Clients tab shows a banner with clients whose payment is due in 1 week / 2 days / today / overdue (driven by each client's `next_payment_date`).</w:t>
+      </w:r>
+    </w:p>
+    <w:p>
+      <w:pPr>
+        <w:pStyle w:val="ListBullet"/>
+      </w:pPr>
+      <w:r>
+        <w:t>**Auto-deactivation** — any active client whose subscription payment is missed past the `SUSPEND_GRACE_DAYS` grace period (default 3 days) is automatically **suspended** (never deleted) on each health cycle; recording a payment resumes it.</w:t>
+      </w:r>
+    </w:p>
+    <w:p>
+      <w:pPr>
+        <w:pStyle w:val="ListBullet"/>
+      </w:pPr>
+      <w:r>
+        <w:t>**Notifications** — a bell in the header lists payment due/overdue, client down, usage-over-limit, deploy/backup/provisioning-failed, and upgrade-request alerts with read state and deduplication.</w:t>
+      </w:r>
+    </w:p>
+    <w:p>
+      <w:pPr>
+        <w:pStyle w:val="ListBullet"/>
+      </w:pPr>
+      <w:r>
+        <w:t>**Audit log** — all admin actions recorded.</w:t>
+      </w:r>
+    </w:p>
+    <w:p>
+      <w:pPr>
+        <w:pStyle w:val="ListBullet"/>
+      </w:pPr>
+      <w:r>
+        <w:t>**2FA** — TOTP protection for operator accounts; API keys bypass 2FA.</w:t>
+      </w:r>
+    </w:p>
+    <w:p/>
+    <w:p>
+      <w:pPr>
         <w:pStyle w:val="Heading3"/>
       </w:pPr>
       <w:r>
-        <w:t>Customer</w:t>
-      </w:r>
-    </w:p>
+        <w:t>Provisioning (Add Client)</w:t>
+      </w:r>
+    </w:p>
+    <w:p>
+      <w:r>
+        <w:t>1. Create a Neon database.</w:t>
+      </w:r>
+    </w:p>
+    <w:p>
+      <w:r>
+        <w:t>2. Create a Render web service for the backend with env vars: `DATABASE_URL`, `JWT_SECRET`, `STORE_NAME`, `ADMIN_*`, `TECH_*`, `CONTROL_PLANE_SECRET`, Cloudinary.</w:t>
+      </w:r>
+    </w:p>
+    <w:p>
+      <w:r>
+        <w:t>3. Create a Vercel project for the frontend (rootDirectory `frontend`, `BACKEND_URL` set).</w:t>
+      </w:r>
+    </w:p>
+    <w:p>
+      <w:r>
+        <w:t>4. Set up Cloudflare DNS subdomain (optional).</w:t>
+      </w:r>
+    </w:p>
+    <w:p>
+      <w:r>
+        <w:t>5. Send a welcome email with credentials.</w:t>
+      </w:r>
+    </w:p>
+    <w:p/>
+    <w:p>
+      <w:r>
+        <w:t>---</w:t>
+      </w:r>
+    </w:p>
+    <w:p/>
+    <w:p>
+      <w:pPr>
+        <w:pStyle w:val="Heading2"/>
+      </w:pPr>
+      <w:r>
+        <w:t>14. Useful Files</w:t>
+      </w:r>
+    </w:p>
+    <w:p/>
     <w:p>
       <w:pPr>
         <w:pStyle w:val="ListBullet"/>
       </w:pPr>
       <w:r>
-        <w:t>Browse products.</w:t>
+        <w:t>`README.md` — full feature overview, languages/technologies, and architecture.</w:t>
       </w:r>
     </w:p>
     <w:p>
@@ -623,7 +1717,7 @@
         <w:pStyle w:val="ListBullet"/>
       </w:pPr>
       <w:r>
-        <w:t>Create an account.</w:t>
+        <w:t>`LOCAL_SETUP.md` — local Windows setup guide.</w:t>
       </w:r>
     </w:p>
     <w:p>
@@ -631,7 +1725,7 @@
         <w:pStyle w:val="ListBullet"/>
       </w:pPr>
       <w:r>
-        <w:t>Add products to cart.</w:t>
+        <w:t>`DEPLOY_CHECKLIST.md` — production deployment checklist.</w:t>
       </w:r>
     </w:p>
     <w:p>
@@ -639,7 +1733,7 @@
         <w:pStyle w:val="ListBullet"/>
       </w:pPr>
       <w:r>
-        <w:t>Book repairs.</w:t>
+        <w:t>`eTIMS_INTEGRATION.md` — KRA eTIMS compliance document.</w:t>
       </w:r>
     </w:p>
     <w:p>
@@ -647,24 +1741,79 @@
         <w:pStyle w:val="ListBullet"/>
       </w:pPr>
       <w:r>
-        <w:t>View repair ticket status and updates.</w:t>
+        <w:t>`ROADMAP.md` — planned roadmap (payment collection, client portal, phone alerts, and more).</w:t>
+      </w:r>
+    </w:p>
+    <w:p>
+      <w:pPr>
+        <w:pStyle w:val="ListBullet"/>
+      </w:pPr>
+      <w:r>
+        <w:t>`control-plane/README.md` — control plane documentation (endpoints, env vars, provisioning).</w:t>
+      </w:r>
+    </w:p>
+    <w:p>
+      <w:pPr>
+        <w:pStyle w:val="ListBullet"/>
+      </w:pPr>
+      <w:r>
+        <w:t>`server/index.ts` — Express entry point (all routes).</w:t>
+      </w:r>
+    </w:p>
+    <w:p>
+      <w:pPr>
+        <w:pStyle w:val="ListBullet"/>
+      </w:pPr>
+      <w:r>
+        <w:t>`server/db.ts` — PostgreSQL layer and migrations.</w:t>
+      </w:r>
+    </w:p>
+    <w:p>
+      <w:pPr>
+        <w:pStyle w:val="ListBullet"/>
+      </w:pPr>
+      <w:r>
+        <w:t>`frontend/lib/app-context.tsx` — global context (auth, theme, settings, tab title).</w:t>
+      </w:r>
+    </w:p>
+    <w:p>
+      <w:pPr>
+        <w:pStyle w:val="ListBullet"/>
+      </w:pPr>
+      <w:r>
+        <w:t>`frontend/layouts/original.tsx` — premium marketing hero implementation.</w:t>
+      </w:r>
+    </w:p>
+    <w:p>
+      <w:pPr>
+        <w:pStyle w:val="ListBullet"/>
+      </w:pPr>
+      <w:r>
+        <w:t>`control-plane/server/provision.ts` — provisioning pipeline (Neon/Render/Vercel/Cloudflare).</w:t>
       </w:r>
     </w:p>
     <w:p/>
     <w:p>
-      <w:pPr>
-        <w:pStyle w:val="Heading3"/>
-      </w:pPr>
-      <w:r>
-        <w:t>Staff</w:t>
-      </w:r>
-    </w:p>
+      <w:r>
+        <w:t>---</w:t>
+      </w:r>
+    </w:p>
+    <w:p/>
+    <w:p>
+      <w:pPr>
+        <w:pStyle w:val="Heading2"/>
+      </w:pPr>
+      <w:r>
+        <w:t>15. Notes</w:t>
+      </w:r>
+    </w:p>
+    <w:p/>
     <w:p>
       <w:pPr>
         <w:pStyle w:val="ListBullet"/>
       </w:pPr>
       <w:r>
-        <w:t>Log in to `/backoffice/`.</w:t>
+        <w:t>The app can be run locally with Node, a `.env` file, and a local PostgreSQL database.</w:t>
       </w:r>
     </w:p>
     <w:p>
@@ -672,7 +1821,7 @@
         <w:pStyle w:val="ListBullet"/>
       </w:pPr>
       <w:r>
-        <w:t>View and update repair tickets.</w:t>
+        <w:t>Backend must have `DATABASE_URL` and a strong `JWT_SECRET` to start.</w:t>
       </w:r>
     </w:p>
     <w:p>
@@ -680,24 +1829,47 @@
         <w:pStyle w:val="ListBullet"/>
       </w:pPr>
       <w:r>
-        <w:t>Add technician notes, ETA, schedule, and note parts used.</w:t>
+        <w:t>Staff tokens expire after 24h, customer tokens after 7 days.</w:t>
+      </w:r>
+    </w:p>
+    <w:p>
+      <w:pPr>
+        <w:pStyle w:val="ListBullet"/>
+      </w:pPr>
+      <w:r>
+        <w:t>Production deployments: backend on Render, frontend on Vercel, databases on Neon.</w:t>
+      </w:r>
+    </w:p>
+    <w:p>
+      <w:pPr>
+        <w:pStyle w:val="ListBullet"/>
+      </w:pPr>
+      <w:r>
+        <w:t>`npm run typecheck` runs TypeScript checks (root, `frontend/`, and `control-plane/` each have the script).</w:t>
       </w:r>
     </w:p>
     <w:p/>
     <w:p>
-      <w:pPr>
-        <w:pStyle w:val="Heading3"/>
-      </w:pPr>
-      <w:r>
-        <w:t>Admin</w:t>
-      </w:r>
-    </w:p>
+      <w:r>
+        <w:t>---</w:t>
+      </w:r>
+    </w:p>
+    <w:p/>
+    <w:p>
+      <w:pPr>
+        <w:pStyle w:val="Heading2"/>
+      </w:pPr>
+      <w:r>
+        <w:t>16. Recommended Next Steps</w:t>
+      </w:r>
+    </w:p>
+    <w:p/>
     <w:p>
       <w:pPr>
         <w:pStyle w:val="ListBullet"/>
       </w:pPr>
       <w:r>
-        <w:t>Log in to `/admin/`.</w:t>
+        <w:t>Enable TypeScript `strict: true` and add ESLint/Prettier + a CI quality gate.</w:t>
       </w:r>
     </w:p>
     <w:p>
@@ -705,7 +1877,7 @@
         <w:pStyle w:val="ListBullet"/>
       </w:pPr>
       <w:r>
-        <w:t>Manage the product catalog.</w:t>
+        <w:t>Break up `server/index.ts` (~5,000 lines) and `frontend/pages/admin.tsx` into route/domain modules.</w:t>
       </w:r>
     </w:p>
     <w:p>
@@ -713,7 +1885,7 @@
         <w:pStyle w:val="ListBullet"/>
       </w:pPr>
       <w:r>
-        <w:t>Upload product images.</w:t>
+        <w:t>Move to formal SQL migrations instead of imperative startup migrations.</w:t>
       </w:r>
     </w:p>
     <w:p>
@@ -721,31 +1893,7 @@
         <w:pStyle w:val="ListBullet"/>
       </w:pPr>
       <w:r>
-        <w:t>Adjust prices and stock.</w:t>
-      </w:r>
-    </w:p>
-    <w:p/>
-    <w:p>
-      <w:r>
-        <w:t>---</w:t>
-      </w:r>
-    </w:p>
-    <w:p/>
-    <w:p>
-      <w:pPr>
-        <w:pStyle w:val="Heading2"/>
-      </w:pPr>
-      <w:r>
-        <w:t>6. Backend API Summary</w:t>
-      </w:r>
-    </w:p>
-    <w:p/>
-    <w:p>
-      <w:pPr>
-        <w:pStyle w:val="Heading3"/>
-      </w:pPr>
-      <w:r>
-        <w:t>Public API</w:t>
+        <w:t>Enforce CSRF hard-fail and a strict CSP.</w:t>
       </w:r>
     </w:p>
     <w:p>
@@ -753,644 +1901,7 @@
         <w:pStyle w:val="ListBullet"/>
       </w:pPr>
       <w:r>
-        <w:t>`GET /api/products` — list products.</w:t>
-      </w:r>
-    </w:p>
-    <w:p>
-      <w:pPr>
-        <w:pStyle w:val="ListBullet"/>
-      </w:pPr>
-      <w:r>
-        <w:t>`GET /api/products/:id` — product details.</w:t>
-      </w:r>
-    </w:p>
-    <w:p>
-      <w:pPr>
-        <w:pStyle w:val="ListBullet"/>
-      </w:pPr>
-      <w:r>
-        <w:t>`GET /api/categories` — valid product categories.</w:t>
-      </w:r>
-    </w:p>
-    <w:p>
-      <w:pPr>
-        <w:pStyle w:val="ListBullet"/>
-      </w:pPr>
-      <w:r>
-        <w:t>`GET /api/settings` — store settings.</w:t>
-      </w:r>
-    </w:p>
-    <w:p/>
-    <w:p>
-      <w:pPr>
-        <w:pStyle w:val="Heading3"/>
-      </w:pPr>
-      <w:r>
-        <w:t>Customer API</w:t>
-      </w:r>
-    </w:p>
-    <w:p>
-      <w:pPr>
-        <w:pStyle w:val="ListBullet"/>
-      </w:pPr>
-      <w:r>
-        <w:t>`POST /api/customer/register` — register a new customer.</w:t>
-      </w:r>
-    </w:p>
-    <w:p>
-      <w:pPr>
-        <w:pStyle w:val="ListBullet"/>
-      </w:pPr>
-      <w:r>
-        <w:t>`POST /api/customer/login` — customer login.</w:t>
-      </w:r>
-    </w:p>
-    <w:p>
-      <w:pPr>
-        <w:pStyle w:val="ListBullet"/>
-      </w:pPr>
-      <w:r>
-        <w:t>`POST /api/repairs` — create repair ticket.</w:t>
-      </w:r>
-    </w:p>
-    <w:p>
-      <w:pPr>
-        <w:pStyle w:val="ListBullet"/>
-      </w:pPr>
-      <w:r>
-        <w:t>`GET /api/repairs/mine` — list customer's repair tickets.</w:t>
-      </w:r>
-    </w:p>
-    <w:p>
-      <w:pPr>
-        <w:pStyle w:val="ListBullet"/>
-      </w:pPr>
-      <w:r>
-        <w:t>`GET /api/repairs/mine/:ticketId` — ticket details.</w:t>
-      </w:r>
-    </w:p>
-    <w:p/>
-    <w:p>
-      <w:pPr>
-        <w:pStyle w:val="Heading3"/>
-      </w:pPr>
-      <w:r>
-        <w:t>Admin / Staff API</w:t>
-      </w:r>
-    </w:p>
-    <w:p>
-      <w:pPr>
-        <w:pStyle w:val="ListBullet"/>
-      </w:pPr>
-      <w:r>
-        <w:t>`POST /api/auth/login` — staff/admin login.</w:t>
-      </w:r>
-    </w:p>
-    <w:p>
-      <w:pPr>
-        <w:pStyle w:val="ListBullet"/>
-      </w:pPr>
-      <w:r>
-        <w:t>`POST /api/products` — create a product.</w:t>
-      </w:r>
-    </w:p>
-    <w:p>
-      <w:pPr>
-        <w:pStyle w:val="ListBullet"/>
-      </w:pPr>
-      <w:r>
-        <w:t>`POST /api/products/:id/image` — upload a product image.</w:t>
-      </w:r>
-    </w:p>
-    <w:p>
-      <w:pPr>
-        <w:pStyle w:val="ListBullet"/>
-      </w:pPr>
-      <w:r>
-        <w:t>`PATCH /api/products/:id/price` — update product price.</w:t>
-      </w:r>
-    </w:p>
-    <w:p>
-      <w:pPr>
-        <w:pStyle w:val="ListBullet"/>
-      </w:pPr>
-      <w:r>
-        <w:t>`DELETE /api/products/:id` — remove a product.</w:t>
-      </w:r>
-    </w:p>
-    <w:p>
-      <w:pPr>
-        <w:pStyle w:val="ListBullet"/>
-      </w:pPr>
-      <w:r>
-        <w:t>`PATCH /api/repairs/:id` — update a repair ticket.</w:t>
-      </w:r>
-    </w:p>
-    <w:p/>
-    <w:p>
-      <w:r>
-        <w:t>---</w:t>
-      </w:r>
-    </w:p>
-    <w:p/>
-    <w:p>
-      <w:pPr>
-        <w:pStyle w:val="Heading2"/>
-      </w:pPr>
-      <w:r>
-        <w:t>7. How Data is Stored</w:t>
-      </w:r>
-    </w:p>
-    <w:p/>
-    <w:p>
-      <w:pPr>
-        <w:pStyle w:val="ListBullet"/>
-      </w:pPr>
-      <w:r>
-        <w:t>`data/store.db` — SQLite database file.</w:t>
-      </w:r>
-    </w:p>
-    <w:p>
-      <w:pPr>
-        <w:pStyle w:val="ListBullet"/>
-      </w:pPr>
-      <w:r>
-        <w:t>`data/uploads/` — uploaded product image files.</w:t>
-      </w:r>
-    </w:p>
-    <w:p>
-      <w:pPr>
-        <w:pStyle w:val="ListBullet"/>
-      </w:pPr>
-      <w:r>
-        <w:t>The database stores products, customers, users, repair tickets, repair updates, and cart contents.</w:t>
-      </w:r>
-    </w:p>
-    <w:p/>
-    <w:p>
-      <w:r>
-        <w:t>---</w:t>
-      </w:r>
-    </w:p>
-    <w:p/>
-    <w:p>
-      <w:pPr>
-        <w:pStyle w:val="Heading2"/>
-      </w:pPr>
-      <w:r>
-        <w:t>8. Repair Workflow</w:t>
-      </w:r>
-    </w:p>
-    <w:p/>
-    <w:p>
-      <w:pPr>
-        <w:pStyle w:val="Heading3"/>
-      </w:pPr>
-      <w:r>
-        <w:t>Customer side</w:t>
-      </w:r>
-    </w:p>
-    <w:p>
-      <w:r>
-        <w:t>1. Customer books a repair via `/repair-book.html`.</w:t>
-      </w:r>
-    </w:p>
-    <w:p>
-      <w:r>
-        <w:t>2. The frontend posts to `/api/repairs`.</w:t>
-      </w:r>
-    </w:p>
-    <w:p>
-      <w:r>
-        <w:t>3. The backend creates a ticket and saves it in SQLite.</w:t>
-      </w:r>
-    </w:p>
-    <w:p>
-      <w:r>
-        <w:t>4. The customer views the ticket list in `account.html`.</w:t>
-      </w:r>
-    </w:p>
-    <w:p>
-      <w:r>
-        <w:t>5. Ticket updates are visible in the repair details and notifications.</w:t>
-      </w:r>
-    </w:p>
-    <w:p/>
-    <w:p>
-      <w:pPr>
-        <w:pStyle w:val="Heading3"/>
-      </w:pPr>
-      <w:r>
-        <w:t>Staff side</w:t>
-      </w:r>
-    </w:p>
-    <w:p>
-      <w:r>
-        <w:t>1. Staff update repair ticket status in `/backoffice/`.</w:t>
-      </w:r>
-    </w:p>
-    <w:p>
-      <w:r>
-        <w:t>2. The backend records updates and customer-visible notes.</w:t>
-      </w:r>
-    </w:p>
-    <w:p>
-      <w:r>
-        <w:t>3. Optional notification logic can email customers or log updates.</w:t>
-      </w:r>
-    </w:p>
-    <w:p/>
-    <w:p>
-      <w:r>
-        <w:t>---</w:t>
-      </w:r>
-    </w:p>
-    <w:p/>
-    <w:p>
-      <w:pPr>
-        <w:pStyle w:val="Heading2"/>
-      </w:pPr>
-      <w:r>
-        <w:t>9. Architecture Diagram</w:t>
-      </w:r>
-    </w:p>
-    <w:p/>
-    <w:p>
-      <w:pPr>
-        <w:pStyle w:val="Heading3"/>
-      </w:pPr>
-      <w:r>
-        <w:t>Runtime architecture</w:t>
-      </w:r>
-    </w:p>
-    <w:p/>
-    <w:p>
-      <w:r>
-        <w:t>```text</w:t>
-      </w:r>
-    </w:p>
-    <w:p>
-      <w:r>
-        <w:t>[Browser Client]</w:t>
-      </w:r>
-    </w:p>
-    <w:p>
-      <w:r>
-        <w:t xml:space="preserve">  ├─ public pages</w:t>
-      </w:r>
-    </w:p>
-    <w:p>
-      <w:r>
-        <w:t xml:space="preserve">  ├─ customer portal</w:t>
-      </w:r>
-    </w:p>
-    <w:p>
-      <w:r>
-        <w:t xml:space="preserve">  ├─ staff backoffice</w:t>
-      </w:r>
-    </w:p>
-    <w:p>
-      <w:r>
-        <w:t xml:space="preserve">  └─ admin panel</w:t>
-      </w:r>
-    </w:p>
-    <w:p>
-      <w:r>
-        <w:t xml:space="preserve">        |</w:t>
-      </w:r>
-    </w:p>
-    <w:p>
-      <w:r>
-        <w:t xml:space="preserve">        | HTTP / Fetch API</w:t>
-      </w:r>
-    </w:p>
-    <w:p>
-      <w:r>
-        <w:t xml:space="preserve">        v</w:t>
-      </w:r>
-    </w:p>
-    <w:p>
-      <w:r>
-        <w:t>[Express Server] server/index.js</w:t>
-      </w:r>
-    </w:p>
-    <w:p>
-      <w:r>
-        <w:t xml:space="preserve">  ├─ public routes</w:t>
-      </w:r>
-    </w:p>
-    <w:p>
-      <w:r>
-        <w:t xml:space="preserve">  ├─ customer routes</w:t>
-      </w:r>
-    </w:p>
-    <w:p>
-      <w:r>
-        <w:t xml:space="preserve">  ├─ staff/admin routes</w:t>
-      </w:r>
-    </w:p>
-    <w:p>
-      <w:r>
-        <w:t xml:space="preserve">  └─ upload/notify helpers</w:t>
-      </w:r>
-    </w:p>
-    <w:p>
-      <w:r>
-        <w:t xml:space="preserve">        |</w:t>
-      </w:r>
-    </w:p>
-    <w:p>
-      <w:r>
-        <w:t xml:space="preserve">        v</w:t>
-      </w:r>
-    </w:p>
-    <w:p>
-      <w:r>
-        <w:t>[SQLite Database] data/store.db</w:t>
-      </w:r>
-    </w:p>
-    <w:p>
-      <w:r>
-        <w:t xml:space="preserve">        |</w:t>
-      </w:r>
-    </w:p>
-    <w:p>
-      <w:r>
-        <w:t xml:space="preserve">        v</w:t>
-      </w:r>
-    </w:p>
-    <w:p>
-      <w:r>
-        <w:t>[Uploads] data/uploads/</w:t>
-      </w:r>
-    </w:p>
-    <w:p>
-      <w:r>
-        <w:t>```</w:t>
-      </w:r>
-    </w:p>
-    <w:p/>
-    <w:p>
-      <w:pPr>
-        <w:pStyle w:val="Heading3"/>
-      </w:pPr>
-      <w:r>
-        <w:t>Component flow</w:t>
-      </w:r>
-    </w:p>
-    <w:p/>
-    <w:p>
-      <w:r>
-        <w:t>```text</w:t>
-      </w:r>
-    </w:p>
-    <w:p>
-      <w:r>
-        <w:t>Customer Browser</w:t>
-      </w:r>
-    </w:p>
-    <w:p>
-      <w:r>
-        <w:t xml:space="preserve">  ├─ account.html</w:t>
-      </w:r>
-    </w:p>
-    <w:p>
-      <w:r>
-        <w:t xml:space="preserve">  ├─ repair-book.html</w:t>
-      </w:r>
-    </w:p>
-    <w:p>
-      <w:r>
-        <w:t xml:space="preserve">  ├─ my-repairs.html</w:t>
-      </w:r>
-    </w:p>
-    <w:p>
-      <w:r>
-        <w:t xml:space="preserve">  └─ customer-auth.js</w:t>
-      </w:r>
-    </w:p>
-    <w:p>
-      <w:r>
-        <w:t xml:space="preserve">        |</w:t>
-      </w:r>
-    </w:p>
-    <w:p>
-      <w:r>
-        <w:t xml:space="preserve">        v</w:t>
-      </w:r>
-    </w:p>
-    <w:p>
-      <w:r>
-        <w:t>Backend API</w:t>
-      </w:r>
-    </w:p>
-    <w:p>
-      <w:r>
-        <w:t xml:space="preserve">  ├─ /api/customer/register</w:t>
-      </w:r>
-    </w:p>
-    <w:p>
-      <w:r>
-        <w:t xml:space="preserve">  ├─ /api/repairs</w:t>
-      </w:r>
-    </w:p>
-    <w:p>
-      <w:r>
-        <w:t xml:space="preserve">  ├─ /api/repairs/mine</w:t>
-      </w:r>
-    </w:p>
-    <w:p>
-      <w:r>
-        <w:t xml:space="preserve">  └─ db.js / repairs.js</w:t>
-      </w:r>
-    </w:p>
-    <w:p>
-      <w:r>
-        <w:t>```</w:t>
-      </w:r>
-    </w:p>
-    <w:p/>
-    <w:p>
-      <w:r>
-        <w:t>---</w:t>
-      </w:r>
-    </w:p>
-    <w:p/>
-    <w:p>
-      <w:pPr>
-        <w:pStyle w:val="Heading2"/>
-      </w:pPr>
-      <w:r>
-        <w:t>10. Useful Files</w:t>
-      </w:r>
-    </w:p>
-    <w:p/>
-    <w:p>
-      <w:pPr>
-        <w:pStyle w:val="ListBullet"/>
-      </w:pPr>
-      <w:r>
-        <w:t>`README.md` — quick start and summary.</w:t>
-      </w:r>
-    </w:p>
-    <w:p>
-      <w:pPr>
-        <w:pStyle w:val="ListBullet"/>
-      </w:pPr>
-      <w:r>
-        <w:t>`package.json` — install and start scripts.</w:t>
-      </w:r>
-    </w:p>
-    <w:p>
-      <w:pPr>
-        <w:pStyle w:val="ListBullet"/>
-      </w:pPr>
-      <w:r>
-        <w:t>`server/index.js` — Express entry point.</w:t>
-      </w:r>
-    </w:p>
-    <w:p>
-      <w:pPr>
-        <w:pStyle w:val="ListBullet"/>
-      </w:pPr>
-      <w:r>
-        <w:t>`server/db.js` — SQLite helpers.</w:t>
-      </w:r>
-    </w:p>
-    <w:p>
-      <w:pPr>
-        <w:pStyle w:val="ListBullet"/>
-      </w:pPr>
-      <w:r>
-        <w:t>`server/repairs.js` — repair logic.</w:t>
-      </w:r>
-    </w:p>
-    <w:p>
-      <w:pPr>
-        <w:pStyle w:val="ListBullet"/>
-      </w:pPr>
-      <w:r>
-        <w:t>`account.html` / `account.js` — customer repair portal.</w:t>
-      </w:r>
-    </w:p>
-    <w:p>
-      <w:pPr>
-        <w:pStyle w:val="ListBullet"/>
-      </w:pPr>
-      <w:r>
-        <w:t>`customer-auth.js` — auth and API wrapper.</w:t>
-      </w:r>
-    </w:p>
-    <w:p>
-      <w:pPr>
-        <w:pStyle w:val="ListBullet"/>
-      </w:pPr>
-      <w:r>
-        <w:t>`admin/` — product management UI.</w:t>
-      </w:r>
-    </w:p>
-    <w:p>
-      <w:pPr>
-        <w:pStyle w:val="ListBullet"/>
-      </w:pPr>
-      <w:r>
-        <w:t>`backoffice/` — staff workflow UI.</w:t>
-      </w:r>
-    </w:p>
-    <w:p/>
-    <w:p>
-      <w:r>
-        <w:t>---</w:t>
-      </w:r>
-    </w:p>
-    <w:p/>
-    <w:p>
-      <w:pPr>
-        <w:pStyle w:val="Heading2"/>
-      </w:pPr>
-      <w:r>
-        <w:t>11. Notes</w:t>
-      </w:r>
-    </w:p>
-    <w:p/>
-    <w:p>
-      <w:pPr>
-        <w:pStyle w:val="ListBullet"/>
-      </w:pPr>
-      <w:r>
-        <w:t>The app can be run locally with Node and a `.env` file.</w:t>
-      </w:r>
-    </w:p>
-    <w:p>
-      <w:pPr>
-        <w:pStyle w:val="ListBullet"/>
-      </w:pPr>
-      <w:r>
-        <w:t>Uploads are stored in `data/uploads` and the database in `data/store.db`.</w:t>
-      </w:r>
-    </w:p>
-    <w:p>
-      <w:pPr>
-        <w:pStyle w:val="ListBullet"/>
-      </w:pPr>
-      <w:r>
-        <w:t>Customer auth uses JWT stored in `localStorage` for browser sessions.</w:t>
-      </w:r>
-    </w:p>
-    <w:p>
-      <w:pPr>
-        <w:pStyle w:val="ListBullet"/>
-      </w:pPr>
-      <w:r>
-        <w:t>Staff/admin auth is handled by middleware in `server/auth.js`.</w:t>
-      </w:r>
-    </w:p>
-    <w:p/>
-    <w:p>
-      <w:r>
-        <w:t>---</w:t>
-      </w:r>
-    </w:p>
-    <w:p/>
-    <w:p>
-      <w:pPr>
-        <w:pStyle w:val="Heading2"/>
-      </w:pPr>
-      <w:r>
-        <w:t>12. Recommended Next Steps</w:t>
-      </w:r>
-    </w:p>
-    <w:p/>
-    <w:p>
-      <w:pPr>
-        <w:pStyle w:val="ListBullet"/>
-      </w:pPr>
-      <w:r>
-        <w:t>Add explicit notification endpoint and message storage.</w:t>
-      </w:r>
-    </w:p>
-    <w:p>
-      <w:pPr>
-        <w:pStyle w:val="ListBullet"/>
-      </w:pPr>
-      <w:r>
-        <w:t>Implement full end-to-end repair ticket tests.</w:t>
-      </w:r>
-    </w:p>
-    <w:p>
-      <w:pPr>
-        <w:pStyle w:val="ListBullet"/>
-      </w:pPr>
-      <w:r>
-        <w:t>Add stronger auth protections for staff/admin routes.</w:t>
-      </w:r>
-    </w:p>
-    <w:p>
-      <w:pPr>
-        <w:pStyle w:val="ListBullet"/>
-      </w:pPr>
-      <w:r>
-        <w:t>Add a README entry inside `user manual` for future documentation.</w:t>
+        <w:t>Add end-to-end tests for provisioning, feature overrides, and layout switching.</w:t>
       </w:r>
     </w:p>
     <w:sectPr>

</xml_diff>